<commit_message>
Unificar flujo de sesiones y mejorar entregables, asistencia y beneficiarios
</commit_message>
<xml_diff>
--- a/plantillas/programa-viaje/Programa_viaje_formato.docx
+++ b/plantillas/programa-viaje/Programa_viaje_formato.docx
@@ -1720,7 +1720,7 @@
                 <w:sz w:val="18"/>
                 <w:szCs w:val="18"/>
               </w:rPr>
-              <w:t>5</w:t>
+              <w:t>4</w:t>
             </w:r>
           </w:p>
         </w:tc>
@@ -1851,7 +1851,7 @@
                 <w:sz w:val="18"/>
                 <w:szCs w:val="18"/>
               </w:rPr>
-              <w:t>6</w:t>
+              <w:t>5</w:t>
             </w:r>
           </w:p>
         </w:tc>
@@ -1982,7 +1982,7 @@
                 <w:sz w:val="18"/>
                 <w:szCs w:val="18"/>
               </w:rPr>
-              <w:t>8</w:t>
+              <w:t>6</w:t>
             </w:r>
           </w:p>
         </w:tc>
@@ -2113,7 +2113,7 @@
                 <w:sz w:val="18"/>
                 <w:szCs w:val="18"/>
               </w:rPr>
-              <w:t>9</w:t>
+              <w:t>7</w:t>
             </w:r>
           </w:p>
         </w:tc>
@@ -2244,7 +2244,7 @@
                 <w:sz w:val="18"/>
                 <w:szCs w:val="18"/>
               </w:rPr>
-              <w:t>9</w:t>
+              <w:t>8</w:t>
             </w:r>
           </w:p>
         </w:tc>
@@ -2376,7 +2376,7 @@
                 <w:sz w:val="18"/>
                 <w:szCs w:val="18"/>
               </w:rPr>
-              <w:t>10</w:t>
+              <w:t>9</w:t>
             </w:r>
           </w:p>
         </w:tc>
@@ -2507,7 +2507,7 @@
                 <w:sz w:val="18"/>
                 <w:szCs w:val="18"/>
               </w:rPr>
-              <w:t>11</w:t>
+              <w:t>10</w:t>
             </w:r>
           </w:p>
         </w:tc>
@@ -2638,7 +2638,7 @@
                 <w:sz w:val="18"/>
                 <w:szCs w:val="18"/>
               </w:rPr>
-              <w:t>14</w:t>
+              <w:t>11</w:t>
             </w:r>
           </w:p>
         </w:tc>
@@ -2769,7 +2769,7 @@
                 <w:sz w:val="18"/>
                 <w:szCs w:val="18"/>
               </w:rPr>
-              <w:t>15</w:t>
+              <w:t>12</w:t>
             </w:r>
           </w:p>
         </w:tc>
@@ -2901,7 +2901,7 @@
                 <w:sz w:val="18"/>
                 <w:szCs w:val="18"/>
               </w:rPr>
-              <w:t>16</w:t>
+              <w:t>13</w:t>
             </w:r>
           </w:p>
         </w:tc>

</xml_diff>